<commit_message>
refactor: eliminar seccion TrustCounters (cifras de experiencia) y optimizar flujo entre FAQ y Contacto
</commit_message>
<xml_diff>
--- a/contratos/requisitos/Requisitos_Informacion_Odontologia_Gabriel_Miranda.docx
+++ b/contratos/requisitos/Requisitos_Informacion_Odontologia_Gabriel_Miranda.docx
@@ -11,6 +11,7 @@
           <w:b/>
           <w:color w:val="000000"/>
           <w:sz w:val="27"/>
+          <w:lang w:val="es-EC"/>
         </w:rPr>
       </w:pPr>
       <w:r>
@@ -19,6 +20,7 @@
           <w:b/>
           <w:color w:val="000000"/>
           <w:sz w:val="27"/>
+          <w:lang w:val="es-EC"/>
         </w:rPr>
         <w:t>REQUERIMIENTOS DE INFORMACIÓN Y RECURSOS</w:t>
       </w:r>
@@ -31,6 +33,7 @@
           <w:rFonts w:ascii="Calibri" w:hAnsi="Calibri" w:cs="Calibri"/>
           <w:color w:val="000000"/>
           <w:sz w:val="20"/>
+          <w:lang w:val="es-EC"/>
         </w:rPr>
       </w:pPr>
       <w:r>
@@ -38,164 +41,10 @@
           <w:rFonts w:ascii="Calibri" w:hAnsi="Calibri" w:cs="Calibri"/>
           <w:color w:val="000000"/>
           <w:sz w:val="20"/>
+          <w:lang w:val="es-EC"/>
         </w:rPr>
         <w:t>Sitio Web Oficial — Odontología Gabriel Miranda</w:t>
       </w:r>
-    </w:p>
-    <w:p>
-      <w:pPr>
-        <w:spacing w:after="40"/>
-        <w:rPr>
-          <w:rFonts w:ascii="Calibri" w:hAnsi="Calibri" w:cs="Calibri"/>
-          <w:color w:val="000000"/>
-          <w:sz w:val="19"/>
-        </w:rPr>
-      </w:pPr>
-      <w:r>
-        <w:rPr>
-          <w:rFonts w:ascii="Calibri" w:hAnsi="Calibri" w:cs="Calibri"/>
-          <w:b/>
-          <w:color w:val="000000"/>
-          <w:sz w:val="19"/>
-        </w:rPr>
-        <w:t>Cliente:</w:t>
-      </w:r>
-      <w:r>
-        <w:rPr>
-          <w:rFonts w:ascii="Calibri" w:hAnsi="Calibri" w:cs="Calibri"/>
-          <w:color w:val="000000"/>
-          <w:sz w:val="19"/>
-        </w:rPr>
-        <w:t xml:space="preserve"> Dr. Gabriel Miranda</w:t>
-      </w:r>
-    </w:p>
-    <w:p>
-      <w:pPr>
-        <w:spacing w:after="40"/>
-        <w:rPr>
-          <w:rFonts w:ascii="Calibri" w:hAnsi="Calibri" w:cs="Calibri"/>
-          <w:color w:val="000000"/>
-          <w:sz w:val="19"/>
-        </w:rPr>
-      </w:pPr>
-      <w:r>
-        <w:rPr>
-          <w:rFonts w:ascii="Calibri" w:hAnsi="Calibri" w:cs="Calibri"/>
-          <w:b/>
-          <w:color w:val="000000"/>
-          <w:sz w:val="19"/>
-        </w:rPr>
-        <w:t>Proyecto:</w:t>
-      </w:r>
-      <w:r>
-        <w:rPr>
-          <w:rFonts w:ascii="Calibri" w:hAnsi="Calibri" w:cs="Calibri"/>
-          <w:color w:val="000000"/>
-          <w:sz w:val="19"/>
-        </w:rPr>
-        <w:t xml:space="preserve"> Landing Page Web (dentistamiranda.web.app)</w:t>
-      </w:r>
-    </w:p>
-    <w:p>
-      <w:pPr>
-        <w:spacing w:after="40"/>
-        <w:rPr>
-          <w:rFonts w:ascii="Calibri" w:hAnsi="Calibri" w:cs="Calibri"/>
-          <w:color w:val="000000"/>
-          <w:sz w:val="19"/>
-        </w:rPr>
-      </w:pPr>
-      <w:r>
-        <w:rPr>
-          <w:rFonts w:ascii="Calibri" w:hAnsi="Calibri" w:cs="Calibri"/>
-          <w:b/>
-          <w:color w:val="000000"/>
-          <w:sz w:val="19"/>
-        </w:rPr>
-        <w:t>Proveedor:</w:t>
-      </w:r>
-      <w:r>
-        <w:rPr>
-          <w:rFonts w:ascii="Calibri" w:hAnsi="Calibri" w:cs="Calibri"/>
-          <w:color w:val="000000"/>
-          <w:sz w:val="19"/>
-        </w:rPr>
-        <w:t xml:space="preserve"> Kindev S.A.S.</w:t>
-      </w:r>
-    </w:p>
-    <w:p>
-      <w:pPr>
-        <w:spacing w:after="40"/>
-        <w:rPr>
-          <w:rFonts w:ascii="Calibri" w:hAnsi="Calibri" w:cs="Calibri"/>
-          <w:color w:val="000000"/>
-          <w:sz w:val="19"/>
-        </w:rPr>
-      </w:pPr>
-      <w:r>
-        <w:rPr>
-          <w:rFonts w:ascii="Calibri" w:hAnsi="Calibri" w:cs="Calibri"/>
-          <w:b/>
-          <w:color w:val="000000"/>
-          <w:sz w:val="19"/>
-        </w:rPr>
-        <w:t>Fecha de Emisión:</w:t>
-      </w:r>
-      <w:r>
-        <w:rPr>
-          <w:rFonts w:ascii="Calibri" w:hAnsi="Calibri" w:cs="Calibri"/>
-          <w:color w:val="000000"/>
-          <w:sz w:val="19"/>
-        </w:rPr>
-        <w:t xml:space="preserve"> 16 de septiembre de 2026</w:t>
-      </w:r>
-    </w:p>
-    <w:p>
-      <w:pPr>
-        <w:spacing w:after="40"/>
-        <w:rPr>
-          <w:rFonts w:ascii="Calibri" w:hAnsi="Calibri" w:cs="Calibri"/>
-          <w:color w:val="000000"/>
-          <w:sz w:val="19"/>
-        </w:rPr>
-      </w:pPr>
-      <w:r>
-        <w:rPr>
-          <w:rFonts w:ascii="Calibri" w:hAnsi="Calibri" w:cs="Calibri"/>
-          <w:b/>
-          <w:color w:val="000000"/>
-          <w:sz w:val="19"/>
-        </w:rPr>
-        <w:t>Canal Exclusivo de Pacientes:</w:t>
-      </w:r>
-      <w:r>
-        <w:rPr>
-          <w:rFonts w:ascii="Calibri" w:hAnsi="Calibri" w:cs="Calibri"/>
-          <w:color w:val="000000"/>
-          <w:sz w:val="19"/>
-        </w:rPr>
-        <w:t xml:space="preserve"> WhatsApp Oficial (Sin telefonía convencional)</w:t>
-      </w:r>
-    </w:p>
-    <w:p>
-      <w:pPr>
-        <w:spacing w:after="120"/>
-        <w:rPr>
-          <w:rFonts w:ascii="Calibri" w:hAnsi="Calibri" w:cs="Calibri"/>
-          <w:color w:val="000000"/>
-          <w:sz w:val="19"/>
-        </w:rPr>
-      </w:pPr>
-    </w:p>
-    <w:p>
-      <w:pPr>
-        <w:spacing w:after="40"/>
-        <w:rPr>
-          <w:rFonts w:ascii="Calibri" w:hAnsi="Calibri" w:cs="Calibri"/>
-          <w:color w:val="000000"/>
-          <w:sz w:val="19"/>
-        </w:rPr>
-      </w:pPr>
     </w:p>
     <w:p>
       <w:pPr>
@@ -205,15 +54,53 @@
           <w:rFonts w:ascii="Calibri" w:hAnsi="Calibri" w:cs="Calibri"/>
           <w:color w:val="000000"/>
           <w:sz w:val="19"/>
-        </w:rPr>
-      </w:pPr>
-      <w:r>
-        <w:rPr>
-          <w:rFonts w:ascii="Calibri" w:hAnsi="Calibri" w:cs="Calibri"/>
-          <w:color w:val="000000"/>
-          <w:sz w:val="19"/>
-        </w:rPr>
-        <w:t>Estimado Dr. Gabriel Miranda: La interfaz y funcionalidad interactiva de su sitio web ya se encuentran desarrolladas y en línea. Para reemplazar la información demostrativa y realizar la publicación oficial definitiva, requerimos la entrega de los siguientes datos y recursos reales:</w:t>
+          <w:lang w:val="es-EC"/>
+        </w:rPr>
+      </w:pPr>
+      <w:r>
+        <w:rPr>
+          <w:rFonts w:ascii="Calibri" w:hAnsi="Calibri" w:cs="Calibri"/>
+          <w:color w:val="000000"/>
+          <w:sz w:val="19"/>
+          <w:lang w:val="es-EC"/>
+        </w:rPr>
+        <w:t>Estimado Dr. Gabriel Miranda</w:t>
+      </w:r>
+      <w:r>
+        <w:rPr>
+          <w:rFonts w:ascii="Calibri" w:hAnsi="Calibri" w:cs="Calibri"/>
+          <w:color w:val="000000"/>
+          <w:sz w:val="19"/>
+          <w:lang w:val="es-EC"/>
+        </w:rPr>
+        <w:t>,</w:t>
+      </w:r>
+      <w:r>
+        <w:rPr>
+          <w:rFonts w:ascii="Calibri" w:hAnsi="Calibri" w:cs="Calibri"/>
+          <w:color w:val="000000"/>
+          <w:sz w:val="19"/>
+          <w:lang w:val="es-EC"/>
+        </w:rPr>
+        <w:t xml:space="preserve"> Para reemplazar la información demostrativa y </w:t>
+      </w:r>
+      <w:r>
+        <w:rPr>
+          <w:rFonts w:ascii="Calibri" w:hAnsi="Calibri" w:cs="Calibri"/>
+          <w:color w:val="000000"/>
+          <w:sz w:val="19"/>
+          <w:lang w:val="es-EC"/>
+        </w:rPr>
+        <w:t>utilizar la información real necesitamos los siguientes datos</w:t>
+      </w:r>
+      <w:r>
+        <w:rPr>
+          <w:rFonts w:ascii="Calibri" w:hAnsi="Calibri" w:cs="Calibri"/>
+          <w:color w:val="000000"/>
+          <w:sz w:val="19"/>
+          <w:lang w:val="es-EC"/>
+        </w:rPr>
+        <w:t>:</w:t>
       </w:r>
     </w:p>
     <w:p>
@@ -224,6 +111,7 @@
           <w:b/>
           <w:color w:val="000000"/>
           <w:sz w:val="21"/>
+          <w:lang w:val="es-EC"/>
         </w:rPr>
       </w:pPr>
       <w:r>
@@ -232,6 +120,7 @@
           <w:b/>
           <w:color w:val="000000"/>
           <w:sz w:val="21"/>
+          <w:lang w:val="es-EC"/>
         </w:rPr>
         <w:t>1. CANAL OFICIAL DE ATENCIÓN (SOLO WHATSAPP)</w:t>
       </w:r>
@@ -249,14 +138,16 @@
           <w:rFonts w:ascii="Calibri" w:hAnsi="Calibri" w:cs="Calibri"/>
           <w:color w:val="000000"/>
           <w:sz w:val="19"/>
-        </w:rPr>
-      </w:pPr>
-      <w:r>
-        <w:rPr>
-          <w:rFonts w:ascii="Calibri" w:hAnsi="Calibri" w:cs="Calibri"/>
-          <w:b/>
-          <w:color w:val="000000"/>
-          <w:sz w:val="19"/>
+          <w:lang w:val="es-EC"/>
+        </w:rPr>
+      </w:pPr>
+      <w:r>
+        <w:rPr>
+          <w:rFonts w:ascii="Calibri" w:hAnsi="Calibri" w:cs="Calibri"/>
+          <w:b/>
+          <w:color w:val="000000"/>
+          <w:sz w:val="19"/>
+          <w:lang w:val="es-EC"/>
         </w:rPr>
         <w:t>Número celular de WhatsApp oficial:</w:t>
       </w:r>
@@ -265,36 +156,9 @@
           <w:rFonts w:ascii="Calibri" w:hAnsi="Calibri" w:cs="Calibri"/>
           <w:color w:val="000000"/>
           <w:sz w:val="19"/>
+          <w:lang w:val="es-EC"/>
         </w:rPr>
         <w:t xml:space="preserve"> Número con código de país (ej. +593 9X XXX XXXX) a donde los pacientes serán dirigidos al hacer clic en Agendar Cita o Consultar.</w:t>
-      </w:r>
-    </w:p>
-    <w:p>
-      <w:pPr>
-        <w:spacing w:before="20" w:after="60"/>
-        <w:jc w:val="both"/>
-        <w:rPr>
-          <w:rFonts w:ascii="Calibri" w:hAnsi="Calibri" w:cs="Calibri"/>
-          <w:color w:val="000000"/>
-          <w:sz w:val="19"/>
-        </w:rPr>
-      </w:pPr>
-      <w:r>
-        <w:rPr>
-          <w:rFonts w:ascii="Calibri" w:hAnsi="Calibri" w:cs="Calibri"/>
-          <w:b/>
-          <w:color w:val="000000"/>
-          <w:sz w:val="19"/>
-        </w:rPr>
-        <w:t>Atención de urgencias dentales:</w:t>
-      </w:r>
-      <w:r>
-        <w:rPr>
-          <w:rFonts w:ascii="Calibri" w:hAnsi="Calibri" w:cs="Calibri"/>
-          <w:color w:val="000000"/>
-          <w:sz w:val="19"/>
-        </w:rPr>
-        <w:t xml:space="preserve"> Confirmar si este mismo número atiende emergencias prioritarias fuera de horario de consulta.</w:t>
       </w:r>
     </w:p>
     <w:p>
@@ -305,13 +169,15 @@
           <w:rFonts w:ascii="Calibri" w:hAnsi="Calibri" w:cs="Calibri"/>
           <w:color w:val="000000"/>
           <w:sz w:val="19"/>
-        </w:rPr>
-      </w:pPr>
-      <w:r>
-        <w:rPr>
-          <w:rFonts w:ascii="Calibri" w:hAnsi="Calibri" w:cs="Calibri"/>
-          <w:color w:val="000000"/>
-          <w:sz w:val="19"/>
+          <w:lang w:val="es-EC"/>
+        </w:rPr>
+      </w:pPr>
+      <w:r>
+        <w:rPr>
+          <w:rFonts w:ascii="Calibri" w:hAnsi="Calibri" w:cs="Calibri"/>
+          <w:color w:val="000000"/>
+          <w:sz w:val="19"/>
+          <w:lang w:val="es-EC"/>
         </w:rPr>
         <w:t>Nota: Todo el contacto se canalizará exclusivamente mediante WhatsApp directo al celular del consultorio; no se integrarán números de teléfono convencionales fijos.</w:t>
       </w:r>
@@ -349,14 +215,16 @@
           <w:rFonts w:ascii="Calibri" w:hAnsi="Calibri" w:cs="Calibri"/>
           <w:color w:val="000000"/>
           <w:sz w:val="19"/>
-        </w:rPr>
-      </w:pPr>
-      <w:r>
-        <w:rPr>
-          <w:rFonts w:ascii="Calibri" w:hAnsi="Calibri" w:cs="Calibri"/>
-          <w:b/>
-          <w:color w:val="000000"/>
-          <w:sz w:val="19"/>
+          <w:lang w:val="es-EC"/>
+        </w:rPr>
+      </w:pPr>
+      <w:r>
+        <w:rPr>
+          <w:rFonts w:ascii="Calibri" w:hAnsi="Calibri" w:cs="Calibri"/>
+          <w:b/>
+          <w:color w:val="000000"/>
+          <w:sz w:val="19"/>
+          <w:lang w:val="es-EC"/>
         </w:rPr>
         <w:t>Nombre formal y especialidad:</w:t>
       </w:r>
@@ -365,6 +233,7 @@
           <w:rFonts w:ascii="Calibri" w:hAnsi="Calibri" w:cs="Calibri"/>
           <w:color w:val="000000"/>
           <w:sz w:val="19"/>
+          <w:lang w:val="es-EC"/>
         </w:rPr>
         <w:t xml:space="preserve"> Denominación exacta deseada (ej. Dr. Gabriel Miranda — Cirujano Dentista / Especialista en Rehabilitación Oral).</w:t>
       </w:r>
@@ -377,14 +246,16 @@
           <w:rFonts w:ascii="Calibri" w:hAnsi="Calibri" w:cs="Calibri"/>
           <w:color w:val="000000"/>
           <w:sz w:val="19"/>
-        </w:rPr>
-      </w:pPr>
-      <w:r>
-        <w:rPr>
-          <w:rFonts w:ascii="Calibri" w:hAnsi="Calibri" w:cs="Calibri"/>
-          <w:b/>
-          <w:color w:val="000000"/>
-          <w:sz w:val="19"/>
+          <w:lang w:val="es-EC"/>
+        </w:rPr>
+      </w:pPr>
+      <w:r>
+        <w:rPr>
+          <w:rFonts w:ascii="Calibri" w:hAnsi="Calibri" w:cs="Calibri"/>
+          <w:b/>
+          <w:color w:val="000000"/>
+          <w:sz w:val="19"/>
+          <w:lang w:val="es-EC"/>
         </w:rPr>
         <w:t>Años de experiencia:</w:t>
       </w:r>
@@ -393,6 +264,7 @@
           <w:rFonts w:ascii="Calibri" w:hAnsi="Calibri" w:cs="Calibri"/>
           <w:color w:val="000000"/>
           <w:sz w:val="19"/>
+          <w:lang w:val="es-EC"/>
         </w:rPr>
         <w:t xml:space="preserve"> Años reales de trayectoria clínica en el ejercicio odontológico.</w:t>
       </w:r>
@@ -410,14 +282,16 @@
           <w:rFonts w:ascii="Calibri" w:hAnsi="Calibri" w:cs="Calibri"/>
           <w:color w:val="000000"/>
           <w:sz w:val="19"/>
-        </w:rPr>
-      </w:pPr>
-      <w:r>
-        <w:rPr>
-          <w:rFonts w:ascii="Calibri" w:hAnsi="Calibri" w:cs="Calibri"/>
-          <w:b/>
-          <w:color w:val="000000"/>
-          <w:sz w:val="19"/>
+          <w:lang w:val="es-EC"/>
+        </w:rPr>
+      </w:pPr>
+      <w:r>
+        <w:rPr>
+          <w:rFonts w:ascii="Calibri" w:hAnsi="Calibri" w:cs="Calibri"/>
+          <w:b/>
+          <w:color w:val="000000"/>
+          <w:sz w:val="19"/>
+          <w:lang w:val="es-EC"/>
         </w:rPr>
         <w:t>Registro profesional / Sanitario:</w:t>
       </w:r>
@@ -426,6 +300,7 @@
           <w:rFonts w:ascii="Calibri" w:hAnsi="Calibri" w:cs="Calibri"/>
           <w:color w:val="000000"/>
           <w:sz w:val="19"/>
+          <w:lang w:val="es-EC"/>
         </w:rPr>
         <w:t xml:space="preserve"> Número de registro SENESCYT, ACESS o MSP para el sello oficial de habilitación sanitaria en la página.</w:t>
       </w:r>
@@ -438,14 +313,16 @@
           <w:rFonts w:ascii="Calibri" w:hAnsi="Calibri" w:cs="Calibri"/>
           <w:color w:val="000000"/>
           <w:sz w:val="19"/>
-        </w:rPr>
-      </w:pPr>
-      <w:r>
-        <w:rPr>
-          <w:rFonts w:ascii="Calibri" w:hAnsi="Calibri" w:cs="Calibri"/>
-          <w:b/>
-          <w:color w:val="000000"/>
-          <w:sz w:val="19"/>
+          <w:lang w:val="es-EC"/>
+        </w:rPr>
+      </w:pPr>
+      <w:r>
+        <w:rPr>
+          <w:rFonts w:ascii="Calibri" w:hAnsi="Calibri" w:cs="Calibri"/>
+          <w:b/>
+          <w:color w:val="000000"/>
+          <w:sz w:val="19"/>
+          <w:lang w:val="es-EC"/>
         </w:rPr>
         <w:t>Títulos universitarios y posgrados:</w:t>
       </w:r>
@@ -454,6 +331,7 @@
           <w:rFonts w:ascii="Calibri" w:hAnsi="Calibri" w:cs="Calibri"/>
           <w:color w:val="000000"/>
           <w:sz w:val="19"/>
+          <w:lang w:val="es-EC"/>
         </w:rPr>
         <w:t xml:space="preserve"> Universidad donde se graduó y especialidades, diplomados o certificaciones clínicas culminadas.</w:t>
       </w:r>
@@ -471,14 +349,16 @@
           <w:rFonts w:ascii="Calibri" w:hAnsi="Calibri" w:cs="Calibri"/>
           <w:color w:val="000000"/>
           <w:sz w:val="19"/>
-        </w:rPr>
-      </w:pPr>
-      <w:r>
-        <w:rPr>
-          <w:rFonts w:ascii="Calibri" w:hAnsi="Calibri" w:cs="Calibri"/>
-          <w:b/>
-          <w:color w:val="000000"/>
-          <w:sz w:val="19"/>
+          <w:lang w:val="es-EC"/>
+        </w:rPr>
+      </w:pPr>
+      <w:r>
+        <w:rPr>
+          <w:rFonts w:ascii="Calibri" w:hAnsi="Calibri" w:cs="Calibri"/>
+          <w:b/>
+          <w:color w:val="000000"/>
+          <w:sz w:val="19"/>
+          <w:lang w:val="es-EC"/>
         </w:rPr>
         <w:t>Filosofía médica:</w:t>
       </w:r>
@@ -487,23 +367,20 @@
           <w:rFonts w:ascii="Calibri" w:hAnsi="Calibri" w:cs="Calibri"/>
           <w:color w:val="000000"/>
           <w:sz w:val="19"/>
+          <w:lang w:val="es-EC"/>
         </w:rPr>
         <w:t xml:space="preserve"> Frase breve (1 a 2 líneas) sobre su compromiso ético y su enfoque de trato cálido y sin dolor al paciente.</w:t>
       </w:r>
     </w:p>
     <w:p>
       <w:pPr>
-        <w:pStyle w:val="Prrafodelista"/>
-        <w:numPr>
-          <w:ilvl w:val="0"/>
-          <w:numId w:val="2"/>
-        </w:numPr>
         <w:spacing w:before="160" w:after="60"/>
         <w:rPr>
           <w:rFonts w:ascii="Calibri" w:hAnsi="Calibri" w:cs="Calibri"/>
           <w:b/>
           <w:color w:val="000000"/>
           <w:sz w:val="21"/>
+          <w:lang w:val="es-EC"/>
         </w:rPr>
       </w:pPr>
       <w:r>
@@ -512,6 +389,7 @@
           <w:b/>
           <w:color w:val="000000"/>
           <w:sz w:val="21"/>
+          <w:lang w:val="es-EC"/>
         </w:rPr>
         <w:t>3. UBICACIÓN FÍSICA Y HORARIOS DE CONSULTORIO</w:t>
       </w:r>
@@ -524,14 +402,16 @@
           <w:rFonts w:ascii="Calibri" w:hAnsi="Calibri" w:cs="Calibri"/>
           <w:color w:val="000000"/>
           <w:sz w:val="19"/>
-        </w:rPr>
-      </w:pPr>
-      <w:r>
-        <w:rPr>
-          <w:rFonts w:ascii="Calibri" w:hAnsi="Calibri" w:cs="Calibri"/>
-          <w:b/>
-          <w:color w:val="000000"/>
-          <w:sz w:val="19"/>
+          <w:lang w:val="es-EC"/>
+        </w:rPr>
+      </w:pPr>
+      <w:r>
+        <w:rPr>
+          <w:rFonts w:ascii="Calibri" w:hAnsi="Calibri" w:cs="Calibri"/>
+          <w:b/>
+          <w:color w:val="000000"/>
+          <w:sz w:val="19"/>
+          <w:lang w:val="es-EC"/>
         </w:rPr>
         <w:t>Dirección física exacta:</w:t>
       </w:r>
@@ -540,6 +420,7 @@
           <w:rFonts w:ascii="Calibri" w:hAnsi="Calibri" w:cs="Calibri"/>
           <w:color w:val="000000"/>
           <w:sz w:val="19"/>
+          <w:lang w:val="es-EC"/>
         </w:rPr>
         <w:t xml:space="preserve"> Ciudad, sector, calles principales, edificio, piso y número de consultorio.</w:t>
       </w:r>
@@ -557,14 +438,16 @@
           <w:rFonts w:ascii="Calibri" w:hAnsi="Calibri" w:cs="Calibri"/>
           <w:color w:val="000000"/>
           <w:sz w:val="19"/>
-        </w:rPr>
-      </w:pPr>
-      <w:r>
-        <w:rPr>
-          <w:rFonts w:ascii="Calibri" w:hAnsi="Calibri" w:cs="Calibri"/>
-          <w:b/>
-          <w:color w:val="000000"/>
-          <w:sz w:val="19"/>
+          <w:lang w:val="es-EC"/>
+        </w:rPr>
+      </w:pPr>
+      <w:r>
+        <w:rPr>
+          <w:rFonts w:ascii="Calibri" w:hAnsi="Calibri" w:cs="Calibri"/>
+          <w:b/>
+          <w:color w:val="000000"/>
+          <w:sz w:val="19"/>
+          <w:lang w:val="es-EC"/>
         </w:rPr>
         <w:t>Enlace de Google Maps:</w:t>
       </w:r>
@@ -573,6 +456,7 @@
           <w:rFonts w:ascii="Calibri" w:hAnsi="Calibri" w:cs="Calibri"/>
           <w:color w:val="000000"/>
           <w:sz w:val="19"/>
+          <w:lang w:val="es-EC"/>
         </w:rPr>
         <w:t xml:space="preserve"> Link directo de la ubicación en Google Maps para activar el botón 'Cómo llegar'.</w:t>
       </w:r>
@@ -585,14 +469,16 @@
           <w:rFonts w:ascii="Calibri" w:hAnsi="Calibri" w:cs="Calibri"/>
           <w:color w:val="000000"/>
           <w:sz w:val="19"/>
-        </w:rPr>
-      </w:pPr>
-      <w:r>
-        <w:rPr>
-          <w:rFonts w:ascii="Calibri" w:hAnsi="Calibri" w:cs="Calibri"/>
-          <w:b/>
-          <w:color w:val="000000"/>
-          <w:sz w:val="19"/>
+          <w:lang w:val="es-EC"/>
+        </w:rPr>
+      </w:pPr>
+      <w:r>
+        <w:rPr>
+          <w:rFonts w:ascii="Calibri" w:hAnsi="Calibri" w:cs="Calibri"/>
+          <w:b/>
+          <w:color w:val="000000"/>
+          <w:sz w:val="19"/>
+          <w:lang w:val="es-EC"/>
         </w:rPr>
         <w:t>Horarios de atención:</w:t>
       </w:r>
@@ -601,6 +487,7 @@
           <w:rFonts w:ascii="Calibri" w:hAnsi="Calibri" w:cs="Calibri"/>
           <w:color w:val="000000"/>
           <w:sz w:val="19"/>
+          <w:lang w:val="es-EC"/>
         </w:rPr>
         <w:t xml:space="preserve"> Detalle de atención de Lunes a Viernes, Sábados (horario o previa cita) y Domingos/Feriados.</w:t>
       </w:r>
@@ -618,14 +505,16 @@
           <w:rFonts w:ascii="Calibri" w:hAnsi="Calibri" w:cs="Calibri"/>
           <w:color w:val="000000"/>
           <w:sz w:val="19"/>
-        </w:rPr>
-      </w:pPr>
-      <w:r>
-        <w:rPr>
-          <w:rFonts w:ascii="Calibri" w:hAnsi="Calibri" w:cs="Calibri"/>
-          <w:b/>
-          <w:color w:val="000000"/>
-          <w:sz w:val="19"/>
+          <w:lang w:val="es-EC"/>
+        </w:rPr>
+      </w:pPr>
+      <w:r>
+        <w:rPr>
+          <w:rFonts w:ascii="Calibri" w:hAnsi="Calibri" w:cs="Calibri"/>
+          <w:b/>
+          <w:color w:val="000000"/>
+          <w:sz w:val="19"/>
+          <w:lang w:val="es-EC"/>
         </w:rPr>
         <w:t>Comodidades del edificio:</w:t>
       </w:r>
@@ -634,17 +523,13 @@
           <w:rFonts w:ascii="Calibri" w:hAnsi="Calibri" w:cs="Calibri"/>
           <w:color w:val="000000"/>
           <w:sz w:val="19"/>
+          <w:lang w:val="es-EC"/>
         </w:rPr>
         <w:t xml:space="preserve"> Confirmar si cuenta con parqueadero para pacientes, ascensor, rampas de acceso y seguridad.</w:t>
       </w:r>
     </w:p>
     <w:p>
       <w:pPr>
-        <w:pStyle w:val="Prrafodelista"/>
-        <w:numPr>
-          <w:ilvl w:val="0"/>
-          <w:numId w:val="3"/>
-        </w:numPr>
         <w:spacing w:before="160" w:after="60"/>
         <w:rPr>
           <w:rFonts w:ascii="Calibri" w:hAnsi="Calibri" w:cs="Calibri"/>
@@ -671,14 +556,16 @@
           <w:rFonts w:ascii="Calibri" w:hAnsi="Calibri" w:cs="Calibri"/>
           <w:color w:val="000000"/>
           <w:sz w:val="19"/>
-        </w:rPr>
-      </w:pPr>
-      <w:r>
-        <w:rPr>
-          <w:rFonts w:ascii="Calibri" w:hAnsi="Calibri" w:cs="Calibri"/>
-          <w:b/>
-          <w:color w:val="000000"/>
-          <w:sz w:val="19"/>
+          <w:lang w:val="es-EC"/>
+        </w:rPr>
+      </w:pPr>
+      <w:r>
+        <w:rPr>
+          <w:rFonts w:ascii="Calibri" w:hAnsi="Calibri" w:cs="Calibri"/>
+          <w:b/>
+          <w:color w:val="000000"/>
+          <w:sz w:val="19"/>
+          <w:lang w:val="es-EC"/>
         </w:rPr>
         <w:t>Instagram:</w:t>
       </w:r>
@@ -687,6 +574,7 @@
           <w:rFonts w:ascii="Calibri" w:hAnsi="Calibri" w:cs="Calibri"/>
           <w:color w:val="000000"/>
           <w:sz w:val="19"/>
+          <w:lang w:val="es-EC"/>
         </w:rPr>
         <w:t xml:space="preserve"> Enlace directo o nombre de usuario (@...).</w:t>
       </w:r>
@@ -704,14 +592,16 @@
           <w:rFonts w:ascii="Calibri" w:hAnsi="Calibri" w:cs="Calibri"/>
           <w:color w:val="000000"/>
           <w:sz w:val="19"/>
-        </w:rPr>
-      </w:pPr>
-      <w:r>
-        <w:rPr>
-          <w:rFonts w:ascii="Calibri" w:hAnsi="Calibri" w:cs="Calibri"/>
-          <w:b/>
-          <w:color w:val="000000"/>
-          <w:sz w:val="19"/>
+          <w:lang w:val="es-EC"/>
+        </w:rPr>
+      </w:pPr>
+      <w:r>
+        <w:rPr>
+          <w:rFonts w:ascii="Calibri" w:hAnsi="Calibri" w:cs="Calibri"/>
+          <w:b/>
+          <w:color w:val="000000"/>
+          <w:sz w:val="19"/>
+          <w:lang w:val="es-EC"/>
         </w:rPr>
         <w:t>Facebook:</w:t>
       </w:r>
@@ -720,6 +610,7 @@
           <w:rFonts w:ascii="Calibri" w:hAnsi="Calibri" w:cs="Calibri"/>
           <w:color w:val="000000"/>
           <w:sz w:val="19"/>
+          <w:lang w:val="es-EC"/>
         </w:rPr>
         <w:t xml:space="preserve"> Enlace a la página de Facebook oficial.</w:t>
       </w:r>
@@ -732,14 +623,16 @@
           <w:rFonts w:ascii="Calibri" w:hAnsi="Calibri" w:cs="Calibri"/>
           <w:color w:val="000000"/>
           <w:sz w:val="19"/>
-        </w:rPr>
-      </w:pPr>
-      <w:r>
-        <w:rPr>
-          <w:rFonts w:ascii="Calibri" w:hAnsi="Calibri" w:cs="Calibri"/>
-          <w:b/>
-          <w:color w:val="000000"/>
-          <w:sz w:val="19"/>
+          <w:lang w:val="es-EC"/>
+        </w:rPr>
+      </w:pPr>
+      <w:r>
+        <w:rPr>
+          <w:rFonts w:ascii="Calibri" w:hAnsi="Calibri" w:cs="Calibri"/>
+          <w:b/>
+          <w:color w:val="000000"/>
+          <w:sz w:val="19"/>
+          <w:lang w:val="es-EC"/>
         </w:rPr>
         <w:t>Otras redes:</w:t>
       </w:r>
@@ -748,6 +641,7 @@
           <w:rFonts w:ascii="Calibri" w:hAnsi="Calibri" w:cs="Calibri"/>
           <w:color w:val="000000"/>
           <w:sz w:val="19"/>
+          <w:lang w:val="es-EC"/>
         </w:rPr>
         <w:t xml:space="preserve"> TikTok o canal de video (opcional).</w:t>
       </w:r>
@@ -760,6 +654,7 @@
           <w:b/>
           <w:color w:val="000000"/>
           <w:sz w:val="21"/>
+          <w:lang w:val="es-EC"/>
         </w:rPr>
       </w:pPr>
       <w:r>
@@ -768,250 +663,150 @@
           <w:b/>
           <w:color w:val="000000"/>
           <w:sz w:val="21"/>
-        </w:rPr>
-        <w:t>5. VALIDACIÓN DE TRATAMIENTOS</w:t>
-      </w:r>
-    </w:p>
-    <w:p>
-      <w:pPr>
-        <w:spacing w:after="80"/>
-        <w:jc w:val="both"/>
-        <w:rPr>
-          <w:rFonts w:ascii="Calibri" w:hAnsi="Calibri" w:cs="Calibri"/>
-          <w:color w:val="000000"/>
-          <w:sz w:val="19"/>
-        </w:rPr>
-      </w:pPr>
-      <w:r>
-        <w:rPr>
-          <w:rFonts w:ascii="Calibri" w:hAnsi="Calibri" w:cs="Calibri"/>
-          <w:color w:val="000000"/>
-          <w:sz w:val="19"/>
-        </w:rPr>
-        <w:t>Actualmente la web muestra 7 especialidades: Ortodoncia 3D, Diseño de Sonrisa / Carillas, Implantes Dentales Guiados, Endodoncia en 1 Sesión, Limpieza Ultrasónica, Blanqueamiento Dental y Odontopediatría.</w:t>
-      </w:r>
-    </w:p>
-    <w:p>
-      <w:pPr>
-        <w:pStyle w:val="Prrafodelista"/>
-        <w:numPr>
-          <w:ilvl w:val="0"/>
-          <w:numId w:val="4"/>
-        </w:numPr>
+          <w:lang w:val="es-EC"/>
+        </w:rPr>
+        <w:t xml:space="preserve">5. </w:t>
+      </w:r>
+      <w:r>
+        <w:rPr>
+          <w:rFonts w:ascii="Calibri" w:hAnsi="Calibri" w:cs="Calibri"/>
+          <w:b/>
+          <w:color w:val="000000"/>
+          <w:sz w:val="21"/>
+          <w:lang w:val="es-EC"/>
+        </w:rPr>
+        <w:t>SERVICIOS Y ESPECIALIDADES</w:t>
+      </w:r>
+    </w:p>
+    <w:p>
+      <w:pPr>
+        <w:spacing w:before="160" w:after="60"/>
+        <w:rPr>
+          <w:rFonts w:ascii="Calibri" w:hAnsi="Calibri" w:cs="Calibri"/>
+          <w:bCs/>
+          <w:color w:val="000000"/>
+          <w:sz w:val="21"/>
+          <w:lang w:val="es-EC"/>
+        </w:rPr>
+      </w:pPr>
+      <w:r>
+        <w:rPr>
+          <w:rFonts w:ascii="Calibri" w:hAnsi="Calibri" w:cs="Calibri"/>
+          <w:bCs/>
+          <w:color w:val="000000"/>
+          <w:sz w:val="21"/>
+          <w:lang w:val="es-EC"/>
+        </w:rPr>
+        <w:t>Separar los servicios básicos de las especialidades:</w:t>
+      </w:r>
+      <w:r>
+        <w:rPr>
+          <w:rFonts w:ascii="Calibri" w:hAnsi="Calibri" w:cs="Calibri"/>
+          <w:bCs/>
+          <w:color w:val="000000"/>
+          <w:sz w:val="21"/>
+          <w:lang w:val="es-EC"/>
+        </w:rPr>
+        <w:br/>
+      </w:r>
+      <w:r>
+        <w:rPr>
+          <w:rFonts w:ascii="Calibri" w:hAnsi="Calibri" w:cs="Calibri"/>
+          <w:b/>
+          <w:color w:val="000000"/>
+          <w:sz w:val="21"/>
+          <w:lang w:val="es-EC"/>
+        </w:rPr>
+        <w:t xml:space="preserve">SERVICIOS: </w:t>
+      </w:r>
+      <w:r>
+        <w:rPr>
+          <w:rFonts w:ascii="Calibri" w:hAnsi="Calibri" w:cs="Calibri"/>
+          <w:bCs/>
+          <w:color w:val="000000"/>
+          <w:sz w:val="21"/>
+          <w:lang w:val="es-EC"/>
+        </w:rPr>
+        <w:t>enumerar todos los tratamientos a incluir, si desea con el precio incluido o sin el precio.</w:t>
+      </w:r>
+      <w:r>
+        <w:rPr>
+          <w:rFonts w:ascii="Calibri" w:hAnsi="Calibri" w:cs="Calibri"/>
+          <w:bCs/>
+          <w:color w:val="000000"/>
+          <w:sz w:val="21"/>
+          <w:lang w:val="es-EC"/>
+        </w:rPr>
+        <w:br/>
+      </w:r>
+      <w:r>
+        <w:rPr>
+          <w:rFonts w:ascii="Calibri" w:hAnsi="Calibri" w:cs="Calibri"/>
+          <w:b/>
+          <w:color w:val="000000"/>
+          <w:sz w:val="21"/>
+          <w:lang w:val="es-EC"/>
+        </w:rPr>
+        <w:t xml:space="preserve">ESPECIALIDADES: </w:t>
+      </w:r>
+      <w:r>
+        <w:rPr>
+          <w:rFonts w:ascii="Calibri" w:hAnsi="Calibri" w:cs="Calibri"/>
+          <w:bCs/>
+          <w:color w:val="000000"/>
+          <w:sz w:val="21"/>
+          <w:lang w:val="es-EC"/>
+        </w:rPr>
+        <w:t>enumerar las especialidades que van a manejar en el consultorio.</w:t>
+      </w:r>
+    </w:p>
+    <w:p>
+      <w:pPr>
+        <w:spacing w:before="160" w:after="60"/>
+        <w:rPr>
+          <w:rFonts w:ascii="Calibri" w:hAnsi="Calibri" w:cs="Calibri"/>
+          <w:b/>
+          <w:color w:val="000000"/>
+          <w:sz w:val="21"/>
+        </w:rPr>
+      </w:pPr>
+      <w:r>
+        <w:rPr>
+          <w:rFonts w:ascii="Calibri" w:hAnsi="Calibri" w:cs="Calibri"/>
+          <w:b/>
+          <w:color w:val="000000"/>
+          <w:sz w:val="21"/>
+        </w:rPr>
+        <w:t>6</w:t>
+      </w:r>
+      <w:r>
+        <w:rPr>
+          <w:rFonts w:ascii="Calibri" w:hAnsi="Calibri" w:cs="Calibri"/>
+          <w:b/>
+          <w:color w:val="000000"/>
+          <w:sz w:val="21"/>
+        </w:rPr>
+        <w:t>. FOTOGRAFÍAS Y LOGOTIPO OFICIAL</w:t>
+      </w:r>
+    </w:p>
+    <w:p>
+      <w:pPr>
         <w:spacing w:before="20" w:after="60"/>
         <w:jc w:val="both"/>
         <w:rPr>
           <w:rFonts w:ascii="Calibri" w:hAnsi="Calibri" w:cs="Calibri"/>
           <w:color w:val="000000"/>
           <w:sz w:val="19"/>
-        </w:rPr>
-      </w:pPr>
-      <w:r>
-        <w:rPr>
-          <w:rFonts w:ascii="Calibri" w:hAnsi="Calibri" w:cs="Calibri"/>
-          <w:b/>
-          <w:color w:val="000000"/>
-          <w:sz w:val="19"/>
-        </w:rPr>
-        <w:t>Confirmación del catálogo:</w:t>
-      </w:r>
-      <w:r>
-        <w:rPr>
-          <w:rFonts w:ascii="Calibri" w:hAnsi="Calibri" w:cs="Calibri"/>
-          <w:color w:val="000000"/>
-          <w:sz w:val="19"/>
-        </w:rPr>
-        <w:t xml:space="preserve"> Validar si realiza todos estos procedimientos o si desea retirar/modificar alguno.</w:t>
-      </w:r>
-    </w:p>
-    <w:p>
-      <w:pPr>
-        <w:spacing w:before="20" w:after="60"/>
-        <w:jc w:val="both"/>
-        <w:rPr>
-          <w:rFonts w:ascii="Calibri" w:hAnsi="Calibri" w:cs="Calibri"/>
-          <w:color w:val="000000"/>
-          <w:sz w:val="19"/>
-        </w:rPr>
-      </w:pPr>
-      <w:r>
-        <w:rPr>
-          <w:rFonts w:ascii="Calibri" w:hAnsi="Calibri" w:cs="Calibri"/>
-          <w:b/>
-          <w:color w:val="000000"/>
-          <w:sz w:val="19"/>
-        </w:rPr>
-        <w:t>Tratamientos adicionales:</w:t>
-      </w:r>
-      <w:r>
-        <w:rPr>
-          <w:rFonts w:ascii="Calibri" w:hAnsi="Calibri" w:cs="Calibri"/>
-          <w:color w:val="000000"/>
-          <w:sz w:val="19"/>
-        </w:rPr>
-        <w:t xml:space="preserve"> Indicar si desea agregar otros procedimientos clave (ej. Cirugía de muelas del juicio, prótesis dentales, periodoncia).</w:t>
-      </w:r>
-    </w:p>
-    <w:p>
-      <w:pPr>
-        <w:pStyle w:val="Prrafodelista"/>
-        <w:numPr>
-          <w:ilvl w:val="0"/>
-          <w:numId w:val="4"/>
-        </w:numPr>
-        <w:spacing w:before="20" w:after="60"/>
-        <w:jc w:val="both"/>
-        <w:rPr>
-          <w:rFonts w:ascii="Calibri" w:hAnsi="Calibri" w:cs="Calibri"/>
-          <w:color w:val="000000"/>
-          <w:sz w:val="19"/>
-        </w:rPr>
-      </w:pPr>
-      <w:r>
-        <w:rPr>
-          <w:rFonts w:ascii="Calibri" w:hAnsi="Calibri" w:cs="Calibri"/>
-          <w:b/>
-          <w:color w:val="000000"/>
-          <w:sz w:val="19"/>
-        </w:rPr>
-        <w:t>Tecnología de consultorio:</w:t>
-      </w:r>
-      <w:r>
-        <w:rPr>
-          <w:rFonts w:ascii="Calibri" w:hAnsi="Calibri" w:cs="Calibri"/>
-          <w:color w:val="000000"/>
-          <w:sz w:val="19"/>
-        </w:rPr>
-        <w:t xml:space="preserve"> Equipamiento real que utiliza (escáner intraoral 3D, radiografía digital, etc.).</w:t>
-      </w:r>
-    </w:p>
-    <w:p>
-      <w:pPr>
-        <w:pStyle w:val="Prrafodelista"/>
-        <w:numPr>
-          <w:ilvl w:val="0"/>
-          <w:numId w:val="4"/>
-        </w:numPr>
-        <w:spacing w:before="160" w:after="60"/>
-        <w:rPr>
-          <w:rFonts w:ascii="Calibri" w:hAnsi="Calibri" w:cs="Calibri"/>
-          <w:b/>
-          <w:color w:val="000000"/>
-          <w:sz w:val="21"/>
-        </w:rPr>
-      </w:pPr>
-      <w:r>
-        <w:rPr>
-          <w:rFonts w:ascii="Calibri" w:hAnsi="Calibri" w:cs="Calibri"/>
-          <w:b/>
-          <w:color w:val="000000"/>
-          <w:sz w:val="21"/>
-        </w:rPr>
-        <w:t>6. CASOS CLÍNICOS REALES ('ANTES Y DESPUÉS')</w:t>
-      </w:r>
-    </w:p>
-    <w:p>
-      <w:pPr>
-        <w:spacing w:before="20" w:after="60"/>
-        <w:jc w:val="both"/>
-        <w:rPr>
-          <w:rFonts w:ascii="Calibri" w:hAnsi="Calibri" w:cs="Calibri"/>
-          <w:color w:val="000000"/>
-          <w:sz w:val="19"/>
-        </w:rPr>
-      </w:pPr>
-      <w:r>
-        <w:rPr>
-          <w:rFonts w:ascii="Calibri" w:hAnsi="Calibri" w:cs="Calibri"/>
-          <w:b/>
-          <w:color w:val="000000"/>
-          <w:sz w:val="19"/>
-        </w:rPr>
-        <w:t>2 a 4 Casos con fotografías:</w:t>
-      </w:r>
-      <w:r>
-        <w:rPr>
-          <w:rFonts w:ascii="Calibri" w:hAnsi="Calibri" w:cs="Calibri"/>
-          <w:color w:val="000000"/>
-          <w:sz w:val="19"/>
-        </w:rPr>
-        <w:t xml:space="preserve"> Foto con buena luz del 'Antes' y del 'Después' de pacientes reales con su autorización.</w:t>
-      </w:r>
-    </w:p>
-    <w:p>
-      <w:pPr>
-        <w:pStyle w:val="Prrafodelista"/>
-        <w:numPr>
-          <w:ilvl w:val="0"/>
-          <w:numId w:val="5"/>
-        </w:numPr>
-        <w:spacing w:before="20" w:after="60"/>
-        <w:jc w:val="both"/>
-        <w:rPr>
-          <w:rFonts w:ascii="Calibri" w:hAnsi="Calibri" w:cs="Calibri"/>
-          <w:color w:val="000000"/>
-          <w:sz w:val="19"/>
-        </w:rPr>
-      </w:pPr>
-      <w:r>
-        <w:rPr>
-          <w:rFonts w:ascii="Calibri" w:hAnsi="Calibri" w:cs="Calibri"/>
-          <w:b/>
-          <w:color w:val="000000"/>
-          <w:sz w:val="19"/>
-        </w:rPr>
-        <w:t>Detalle de cada caso:</w:t>
-      </w:r>
-      <w:r>
-        <w:rPr>
-          <w:rFonts w:ascii="Calibri" w:hAnsi="Calibri" w:cs="Calibri"/>
-          <w:color w:val="000000"/>
-          <w:sz w:val="19"/>
-        </w:rPr>
-        <w:t xml:space="preserve"> Tratamiento realizado, duración aproximada o citas requeridas, e inicial o nombre de pila del paciente (ej. 'Valeria M.').</w:t>
-      </w:r>
-    </w:p>
-    <w:p>
-      <w:pPr>
-        <w:pStyle w:val="Prrafodelista"/>
-        <w:numPr>
-          <w:ilvl w:val="0"/>
-          <w:numId w:val="5"/>
-        </w:numPr>
-        <w:spacing w:before="160" w:after="60"/>
-        <w:rPr>
-          <w:rFonts w:ascii="Calibri" w:hAnsi="Calibri" w:cs="Calibri"/>
-          <w:b/>
-          <w:color w:val="000000"/>
-          <w:sz w:val="21"/>
-        </w:rPr>
-      </w:pPr>
-      <w:r>
-        <w:rPr>
-          <w:rFonts w:ascii="Calibri" w:hAnsi="Calibri" w:cs="Calibri"/>
-          <w:b/>
-          <w:color w:val="000000"/>
-          <w:sz w:val="21"/>
-        </w:rPr>
-        <w:t>7. FOTOGRAFÍAS Y LOGOTIPO OFICIAL</w:t>
-      </w:r>
-    </w:p>
-    <w:p>
-      <w:pPr>
-        <w:spacing w:before="20" w:after="60"/>
-        <w:jc w:val="both"/>
-        <w:rPr>
-          <w:rFonts w:ascii="Calibri" w:hAnsi="Calibri" w:cs="Calibri"/>
-          <w:color w:val="000000"/>
-          <w:sz w:val="19"/>
-        </w:rPr>
-      </w:pPr>
-      <w:r>
-        <w:rPr>
-          <w:rFonts w:ascii="Calibri" w:hAnsi="Calibri" w:cs="Calibri"/>
-          <w:b/>
-          <w:color w:val="000000"/>
-          <w:sz w:val="19"/>
+          <w:lang w:val="es-EC"/>
+        </w:rPr>
+      </w:pPr>
+      <w:r>
+        <w:rPr>
+          <w:rFonts w:ascii="Calibri" w:hAnsi="Calibri" w:cs="Calibri"/>
+          <w:b/>
+          <w:color w:val="000000"/>
+          <w:sz w:val="19"/>
+          <w:lang w:val="es-EC"/>
         </w:rPr>
         <w:t>Foto profesional del Dr. Gabriel Miranda:</w:t>
       </w:r>
@@ -1020,6 +815,7 @@
           <w:rFonts w:ascii="Calibri" w:hAnsi="Calibri" w:cs="Calibri"/>
           <w:color w:val="000000"/>
           <w:sz w:val="19"/>
+          <w:lang w:val="es-EC"/>
         </w:rPr>
         <w:t xml:space="preserve"> Fotografía en alta calidad con bata o vestimenta médica formal para el perfil principal.</w:t>
       </w:r>
@@ -1037,14 +833,16 @@
           <w:rFonts w:ascii="Calibri" w:hAnsi="Calibri" w:cs="Calibri"/>
           <w:color w:val="000000"/>
           <w:sz w:val="19"/>
-        </w:rPr>
-      </w:pPr>
-      <w:r>
-        <w:rPr>
-          <w:rFonts w:ascii="Calibri" w:hAnsi="Calibri" w:cs="Calibri"/>
-          <w:b/>
-          <w:color w:val="000000"/>
-          <w:sz w:val="19"/>
+          <w:lang w:val="es-EC"/>
+        </w:rPr>
+      </w:pPr>
+      <w:r>
+        <w:rPr>
+          <w:rFonts w:ascii="Calibri" w:hAnsi="Calibri" w:cs="Calibri"/>
+          <w:b/>
+          <w:color w:val="000000"/>
+          <w:sz w:val="19"/>
+          <w:lang w:val="es-EC"/>
         </w:rPr>
         <w:t>Fotos de las instalaciones:</w:t>
       </w:r>
@@ -1053,6 +851,7 @@
           <w:rFonts w:ascii="Calibri" w:hAnsi="Calibri" w:cs="Calibri"/>
           <w:color w:val="000000"/>
           <w:sz w:val="19"/>
+          <w:lang w:val="es-EC"/>
         </w:rPr>
         <w:t xml:space="preserve"> 2 a 3 fotografías reales del sillón odontológico, área clínica o sala de espera.</w:t>
       </w:r>
@@ -1065,14 +864,16 @@
           <w:rFonts w:ascii="Calibri" w:hAnsi="Calibri" w:cs="Calibri"/>
           <w:color w:val="000000"/>
           <w:sz w:val="19"/>
-        </w:rPr>
-      </w:pPr>
-      <w:r>
-        <w:rPr>
-          <w:rFonts w:ascii="Calibri" w:hAnsi="Calibri" w:cs="Calibri"/>
-          <w:b/>
-          <w:color w:val="000000"/>
-          <w:sz w:val="19"/>
+          <w:lang w:val="es-EC"/>
+        </w:rPr>
+      </w:pPr>
+      <w:r>
+        <w:rPr>
+          <w:rFonts w:ascii="Calibri" w:hAnsi="Calibri" w:cs="Calibri"/>
+          <w:b/>
+          <w:color w:val="000000"/>
+          <w:sz w:val="19"/>
+          <w:lang w:val="es-EC"/>
         </w:rPr>
         <w:t>Logotipo de la clínica:</w:t>
       </w:r>
@@ -1081,18 +882,92 @@
           <w:rFonts w:ascii="Calibri" w:hAnsi="Calibri" w:cs="Calibri"/>
           <w:color w:val="000000"/>
           <w:sz w:val="19"/>
+          <w:lang w:val="es-EC"/>
         </w:rPr>
         <w:t xml:space="preserve"> Archivo en formato vectorial (.SVG, .AI) o imagen PNG transparente en alta resolución.</w:t>
       </w:r>
     </w:p>
     <w:p>
       <w:pPr>
+        <w:spacing w:before="20" w:after="60"/>
+        <w:jc w:val="both"/>
+        <w:rPr>
+          <w:rFonts w:ascii="Calibri" w:hAnsi="Calibri" w:cs="Calibri"/>
+          <w:color w:val="000000"/>
+          <w:sz w:val="19"/>
+          <w:lang w:val="es-EC"/>
+        </w:rPr>
+      </w:pPr>
+    </w:p>
+    <w:p>
+      <w:pPr>
+        <w:spacing w:before="20" w:after="60"/>
+        <w:jc w:val="both"/>
+        <w:rPr>
+          <w:rFonts w:ascii="Calibri" w:hAnsi="Calibri" w:cs="Calibri"/>
+          <w:color w:val="000000"/>
+          <w:sz w:val="19"/>
+          <w:lang w:val="es-EC"/>
+        </w:rPr>
+      </w:pPr>
+    </w:p>
+    <w:p>
+      <w:pPr>
+        <w:spacing w:before="20" w:after="60"/>
+        <w:jc w:val="both"/>
+        <w:rPr>
+          <w:rFonts w:ascii="Calibri" w:hAnsi="Calibri" w:cs="Calibri"/>
+          <w:color w:val="000000"/>
+          <w:sz w:val="19"/>
+          <w:lang w:val="es-EC"/>
+        </w:rPr>
+      </w:pPr>
+    </w:p>
+    <w:p>
+      <w:pPr>
+        <w:spacing w:before="20" w:after="60"/>
+        <w:jc w:val="both"/>
+        <w:rPr>
+          <w:rFonts w:ascii="Calibri" w:hAnsi="Calibri" w:cs="Calibri"/>
+          <w:color w:val="000000"/>
+          <w:sz w:val="19"/>
+          <w:lang w:val="es-EC"/>
+        </w:rPr>
+      </w:pPr>
+    </w:p>
+    <w:p>
+      <w:pPr>
+        <w:spacing w:before="20" w:after="60"/>
+        <w:jc w:val="both"/>
+        <w:rPr>
+          <w:rFonts w:ascii="Calibri" w:hAnsi="Calibri" w:cs="Calibri"/>
+          <w:color w:val="000000"/>
+          <w:sz w:val="19"/>
+          <w:lang w:val="es-EC"/>
+        </w:rPr>
+      </w:pPr>
+    </w:p>
+    <w:p>
+      <w:pPr>
+        <w:spacing w:before="20" w:after="60"/>
+        <w:jc w:val="both"/>
+        <w:rPr>
+          <w:rFonts w:ascii="Calibri" w:hAnsi="Calibri" w:cs="Calibri"/>
+          <w:color w:val="000000"/>
+          <w:sz w:val="19"/>
+          <w:lang w:val="es-EC"/>
+        </w:rPr>
+      </w:pPr>
+    </w:p>
+    <w:p>
+      <w:pPr>
         <w:spacing w:before="160" w:after="60"/>
         <w:rPr>
           <w:rFonts w:ascii="Calibri" w:hAnsi="Calibri" w:cs="Calibri"/>
           <w:b/>
           <w:color w:val="000000"/>
           <w:sz w:val="21"/>
+          <w:lang w:val="es-EC"/>
         </w:rPr>
       </w:pPr>
       <w:r>
@@ -1101,8 +976,20 @@
           <w:b/>
           <w:color w:val="000000"/>
           <w:sz w:val="21"/>
-        </w:rPr>
-        <w:t>8. FORMAS DE PAGO Y TRATAMIENTOS A CRÉDITO</w:t>
+          <w:lang w:val="es-EC"/>
+        </w:rPr>
+        <w:lastRenderedPageBreak/>
+        <w:t>7</w:t>
+      </w:r>
+      <w:r>
+        <w:rPr>
+          <w:rFonts w:ascii="Calibri" w:hAnsi="Calibri" w:cs="Calibri"/>
+          <w:b/>
+          <w:color w:val="000000"/>
+          <w:sz w:val="21"/>
+          <w:lang w:val="es-EC"/>
+        </w:rPr>
+        <w:t>. FORMAS DE PAGO Y TRATAMIENTOS A CRÉDITO</w:t>
       </w:r>
     </w:p>
     <w:p>
@@ -1113,13 +1000,15 @@
           <w:rFonts w:ascii="Calibri" w:hAnsi="Calibri" w:cs="Calibri"/>
           <w:color w:val="000000"/>
           <w:sz w:val="19"/>
-        </w:rPr>
-      </w:pPr>
-      <w:r>
-        <w:rPr>
-          <w:rFonts w:ascii="Calibri" w:hAnsi="Calibri" w:cs="Calibri"/>
-          <w:color w:val="000000"/>
-          <w:sz w:val="19"/>
+          <w:lang w:val="es-EC"/>
+        </w:rPr>
+      </w:pPr>
+      <w:r>
+        <w:rPr>
+          <w:rFonts w:ascii="Calibri" w:hAnsi="Calibri" w:cs="Calibri"/>
+          <w:color w:val="000000"/>
+          <w:sz w:val="19"/>
+          <w:lang w:val="es-EC"/>
         </w:rPr>
         <w:t>Nota aclaratoria: La web funciona como canal informativo y de captación hacia WhatsApp (no procesa cobros en línea).</w:t>
       </w:r>
@@ -1137,14 +1026,16 @@
           <w:rFonts w:ascii="Calibri" w:hAnsi="Calibri" w:cs="Calibri"/>
           <w:color w:val="000000"/>
           <w:sz w:val="19"/>
-        </w:rPr>
-      </w:pPr>
-      <w:r>
-        <w:rPr>
-          <w:rFonts w:ascii="Calibri" w:hAnsi="Calibri" w:cs="Calibri"/>
-          <w:b/>
-          <w:color w:val="000000"/>
-          <w:sz w:val="19"/>
+          <w:lang w:val="es-EC"/>
+        </w:rPr>
+      </w:pPr>
+      <w:r>
+        <w:rPr>
+          <w:rFonts w:ascii="Calibri" w:hAnsi="Calibri" w:cs="Calibri"/>
+          <w:b/>
+          <w:color w:val="000000"/>
+          <w:sz w:val="19"/>
+          <w:lang w:val="es-EC"/>
         </w:rPr>
         <w:t>Consulta de valoración:</w:t>
       </w:r>
@@ -1153,6 +1044,7 @@
           <w:rFonts w:ascii="Calibri" w:hAnsi="Calibri" w:cs="Calibri"/>
           <w:color w:val="000000"/>
           <w:sz w:val="19"/>
+          <w:lang w:val="es-EC"/>
         </w:rPr>
         <w:t xml:space="preserve"> Indicar si la primera cita tiene costo fijado o incluye diagnóstico/escaneo preliminar.</w:t>
       </w:r>
@@ -1165,14 +1057,16 @@
           <w:rFonts w:ascii="Calibri" w:hAnsi="Calibri" w:cs="Calibri"/>
           <w:color w:val="000000"/>
           <w:sz w:val="19"/>
-        </w:rPr>
-      </w:pPr>
-      <w:r>
-        <w:rPr>
-          <w:rFonts w:ascii="Calibri" w:hAnsi="Calibri" w:cs="Calibri"/>
-          <w:b/>
-          <w:color w:val="000000"/>
-          <w:sz w:val="19"/>
+          <w:lang w:val="es-EC"/>
+        </w:rPr>
+      </w:pPr>
+      <w:r>
+        <w:rPr>
+          <w:rFonts w:ascii="Calibri" w:hAnsi="Calibri" w:cs="Calibri"/>
+          <w:b/>
+          <w:color w:val="000000"/>
+          <w:sz w:val="19"/>
+          <w:lang w:val="es-EC"/>
         </w:rPr>
         <w:t>Métodos de cobro en consultorio:</w:t>
       </w:r>
@@ -1181,6 +1075,7 @@
           <w:rFonts w:ascii="Calibri" w:hAnsi="Calibri" w:cs="Calibri"/>
           <w:color w:val="000000"/>
           <w:sz w:val="19"/>
+          <w:lang w:val="es-EC"/>
         </w:rPr>
         <w:t xml:space="preserve"> Efectivo, transferencias bancarias, tarjetas de débito o crédito.</w:t>
       </w:r>
@@ -1198,14 +1093,16 @@
           <w:rFonts w:ascii="Calibri" w:hAnsi="Calibri" w:cs="Calibri"/>
           <w:color w:val="000000"/>
           <w:sz w:val="19"/>
-        </w:rPr>
-      </w:pPr>
-      <w:r>
-        <w:rPr>
-          <w:rFonts w:ascii="Calibri" w:hAnsi="Calibri" w:cs="Calibri"/>
-          <w:b/>
-          <w:color w:val="000000"/>
-          <w:sz w:val="19"/>
+          <w:lang w:val="es-EC"/>
+        </w:rPr>
+      </w:pPr>
+      <w:r>
+        <w:rPr>
+          <w:rFonts w:ascii="Calibri" w:hAnsi="Calibri" w:cs="Calibri"/>
+          <w:b/>
+          <w:color w:val="000000"/>
+          <w:sz w:val="19"/>
+          <w:lang w:val="es-EC"/>
         </w:rPr>
         <w:t>Detalle de tratamientos grandes a crédito en varias citas (Importante):</w:t>
       </w:r>
@@ -1214,6 +1111,7 @@
           <w:rFonts w:ascii="Calibri" w:hAnsi="Calibri" w:cs="Calibri"/>
           <w:color w:val="000000"/>
           <w:sz w:val="19"/>
+          <w:lang w:val="es-EC"/>
         </w:rPr>
         <w:t xml:space="preserve"> Para explicar a los pacientes de forma transparente y atractiva en la página cómo pueden financiar tratamientos de alto costo (Ortodoncia, Implantes, Diseños de Sonrisa), requerimos que nos detalle:</w:t>
       </w:r>
@@ -1227,6 +1125,7 @@
           <w:rFonts w:ascii="Calibri" w:hAnsi="Calibri" w:cs="Calibri"/>
           <w:color w:val="000000"/>
           <w:sz w:val="18"/>
+          <w:lang w:val="es-EC"/>
         </w:rPr>
       </w:pPr>
       <w:r>
@@ -1235,6 +1134,7 @@
           <w:b/>
           <w:color w:val="000000"/>
           <w:sz w:val="18"/>
+          <w:lang w:val="es-EC"/>
         </w:rPr>
         <w:t>a)</w:t>
       </w:r>
@@ -1243,6 +1143,7 @@
           <w:rFonts w:ascii="Calibri" w:hAnsi="Calibri" w:cs="Calibri"/>
           <w:color w:val="000000"/>
           <w:sz w:val="18"/>
+          <w:lang w:val="es-EC"/>
         </w:rPr>
         <w:t xml:space="preserve"> ¿Cómo se dividen los pagos a lo largo del tratamiento? (Ej. anticipo inicial y saldo distribuido en cuotas mensuales fijas o pagos por cada cita de control).</w:t>
       </w:r>
@@ -1261,6 +1162,7 @@
           <w:rFonts w:ascii="Calibri" w:hAnsi="Calibri" w:cs="Calibri"/>
           <w:color w:val="000000"/>
           <w:sz w:val="18"/>
+          <w:lang w:val="es-EC"/>
         </w:rPr>
       </w:pPr>
       <w:r>
@@ -1269,6 +1171,7 @@
           <w:b/>
           <w:color w:val="000000"/>
           <w:sz w:val="18"/>
+          <w:lang w:val="es-EC"/>
         </w:rPr>
         <w:t>b)</w:t>
       </w:r>
@@ -1277,6 +1180,7 @@
           <w:rFonts w:ascii="Calibri" w:hAnsi="Calibri" w:cs="Calibri"/>
           <w:color w:val="000000"/>
           <w:sz w:val="18"/>
+          <w:lang w:val="es-EC"/>
         </w:rPr>
         <w:t xml:space="preserve"> ¿Requiere un valor o porcentaje específico de entrada/anticipo?</w:t>
       </w:r>
@@ -1290,6 +1194,7 @@
           <w:rFonts w:ascii="Calibri" w:hAnsi="Calibri" w:cs="Calibri"/>
           <w:color w:val="000000"/>
           <w:sz w:val="18"/>
+          <w:lang w:val="es-EC"/>
         </w:rPr>
       </w:pPr>
       <w:r>
@@ -1298,6 +1203,7 @@
           <w:b/>
           <w:color w:val="000000"/>
           <w:sz w:val="18"/>
+          <w:lang w:val="es-EC"/>
         </w:rPr>
         <w:t>c)</w:t>
       </w:r>
@@ -1306,6 +1212,7 @@
           <w:rFonts w:ascii="Calibri" w:hAnsi="Calibri" w:cs="Calibri"/>
           <w:color w:val="000000"/>
           <w:sz w:val="18"/>
+          <w:lang w:val="es-EC"/>
         </w:rPr>
         <w:t xml:space="preserve"> ¿Ofrece opciones de pago con tarjeta de crédito diferido a meses sin intereses?</w:t>
       </w:r>
@@ -1313,12 +1220,12 @@
     <w:p>
       <w:pPr>
         <w:spacing w:before="160" w:after="60"/>
-        <w:ind w:left="360"/>
         <w:rPr>
           <w:rFonts w:ascii="Calibri" w:hAnsi="Calibri" w:cs="Calibri"/>
           <w:b/>
           <w:color w:val="000000"/>
           <w:sz w:val="21"/>
+          <w:lang w:val="es-EC"/>
         </w:rPr>
       </w:pPr>
       <w:r>
@@ -1327,8 +1234,19 @@
           <w:b/>
           <w:color w:val="000000"/>
           <w:sz w:val="21"/>
-        </w:rPr>
-        <w:t>9. ENTREGA DE LA INFORMACIÓN</w:t>
+          <w:lang w:val="es-EC"/>
+        </w:rPr>
+        <w:t>8</w:t>
+      </w:r>
+      <w:r>
+        <w:rPr>
+          <w:rFonts w:ascii="Calibri" w:hAnsi="Calibri" w:cs="Calibri"/>
+          <w:b/>
+          <w:color w:val="000000"/>
+          <w:sz w:val="21"/>
+          <w:lang w:val="es-EC"/>
+        </w:rPr>
+        <w:t>. ENTREGA DE LA INFORMACIÓN</w:t>
       </w:r>
     </w:p>
     <w:p>
@@ -1340,13 +1258,15 @@
           <w:rFonts w:ascii="Calibri" w:hAnsi="Calibri" w:cs="Calibri"/>
           <w:color w:val="000000"/>
           <w:sz w:val="19"/>
-        </w:rPr>
-      </w:pPr>
-      <w:r>
-        <w:rPr>
-          <w:rFonts w:ascii="Calibri" w:hAnsi="Calibri" w:cs="Calibri"/>
-          <w:color w:val="000000"/>
-          <w:sz w:val="19"/>
+          <w:lang w:val="es-EC"/>
+        </w:rPr>
+      </w:pPr>
+      <w:r>
+        <w:rPr>
+          <w:rFonts w:ascii="Calibri" w:hAnsi="Calibri" w:cs="Calibri"/>
+          <w:color w:val="000000"/>
+          <w:sz w:val="19"/>
+          <w:lang w:val="es-EC"/>
         </w:rPr>
         <w:t>Puede enviar las fotografías, textos y logotipo compilados en un enlace de Google Drive / OneDrive, o directamente por WhatsApp en formato archivo/documento para preservar la máxima calidad de las imágenes.</w:t>
       </w:r>
@@ -1360,6 +1280,7 @@
           <w:rFonts w:ascii="Calibri" w:hAnsi="Calibri" w:cs="Calibri"/>
           <w:color w:val="000000"/>
           <w:sz w:val="19"/>
+          <w:lang w:val="es-EC"/>
         </w:rPr>
       </w:pPr>
     </w:p>

</xml_diff>